<commit_message>
Use Word heading styles and fixed table column widths in the Fable5.1 document
Co-authored-by: xinyuenie <xinyuenie@gmail.com>
</commit_message>
<xml_diff>
--- a/基于客体属性的主体行为的时空分布逻辑202609061930Fable5.1.docx
+++ b/基于客体属性的主体行为的时空分布逻辑202609061930Fable5.1.docx
@@ -139,18 +139,19 @@
         <w:tblStyle w:val="TableGrid"/>
         <w:tblW w:type="auto" w:w="0"/>
         <w:jc w:val="center"/>
+        <w:tblLayout w:type="fixed"/>
         <w:tblLook w:firstColumn="1" w:firstRow="1" w:lastColumn="0" w:lastRow="0" w:noHBand="0" w:noVBand="1" w:val="04A0"/>
       </w:tblPr>
       <w:tblGrid>
-        <w:gridCol w:w="2209"/>
-        <w:gridCol w:w="2209"/>
-        <w:gridCol w:w="2209"/>
-        <w:gridCol w:w="2209"/>
+        <w:gridCol w:w="1587"/>
+        <w:gridCol w:w="907"/>
+        <w:gridCol w:w="3345"/>
+        <w:gridCol w:w="2665"/>
       </w:tblGrid>
       <w:tr>
         <w:tc>
           <w:tcPr>
-            <w:tcW w:type="dxa" w:w="1474"/>
+            <w:tcW w:type="dxa" w:w="1587"/>
             <w:shd w:val="clear" w:color="auto" w:fill="D9E2F3"/>
           </w:tcPr>
           <w:p>
@@ -170,7 +171,7 @@
         </w:tc>
         <w:tc>
           <w:tcPr>
-            <w:tcW w:type="dxa" w:w="794"/>
+            <w:tcW w:type="dxa" w:w="907"/>
             <w:shd w:val="clear" w:color="auto" w:fill="D9E2F3"/>
           </w:tcPr>
           <w:p>
@@ -191,7 +192,7 @@
         </w:tc>
         <w:tc>
           <w:tcPr>
-            <w:tcW w:type="dxa" w:w="3515"/>
+            <w:tcW w:type="dxa" w:w="3345"/>
             <w:shd w:val="clear" w:color="auto" w:fill="D9E2F3"/>
           </w:tcPr>
           <w:p>
@@ -211,7 +212,7 @@
         </w:tc>
         <w:tc>
           <w:tcPr>
-            <w:tcW w:type="dxa" w:w="2721"/>
+            <w:tcW w:type="dxa" w:w="2665"/>
             <w:shd w:val="clear" w:color="auto" w:fill="D9E2F3"/>
           </w:tcPr>
           <w:p>
@@ -233,7 +234,7 @@
       <w:tr>
         <w:tc>
           <w:tcPr>
-            <w:tcW w:type="dxa" w:w="1474"/>
+            <w:tcW w:type="dxa" w:w="1587"/>
           </w:tcPr>
           <w:p>
             <w:pPr>
@@ -252,7 +253,7 @@
         </w:tc>
         <w:tc>
           <w:tcPr>
-            <w:tcW w:type="dxa" w:w="794"/>
+            <w:tcW w:type="dxa" w:w="907"/>
           </w:tcPr>
           <w:p>
             <w:pPr>
@@ -272,7 +273,7 @@
         </w:tc>
         <w:tc>
           <w:tcPr>
-            <w:tcW w:type="dxa" w:w="3515"/>
+            <w:tcW w:type="dxa" w:w="3345"/>
           </w:tcPr>
           <w:p>
             <w:pPr>
@@ -291,7 +292,7 @@
         </w:tc>
         <w:tc>
           <w:tcPr>
-            <w:tcW w:type="dxa" w:w="2721"/>
+            <w:tcW w:type="dxa" w:w="2665"/>
           </w:tcPr>
           <w:p>
             <w:pPr>
@@ -312,7 +313,7 @@
       <w:tr>
         <w:tc>
           <w:tcPr>
-            <w:tcW w:type="dxa" w:w="1474"/>
+            <w:tcW w:type="dxa" w:w="1587"/>
           </w:tcPr>
           <w:p>
             <w:pPr>
@@ -331,7 +332,7 @@
         </w:tc>
         <w:tc>
           <w:tcPr>
-            <w:tcW w:type="dxa" w:w="794"/>
+            <w:tcW w:type="dxa" w:w="907"/>
           </w:tcPr>
           <w:p>
             <w:pPr>
@@ -351,7 +352,7 @@
         </w:tc>
         <w:tc>
           <w:tcPr>
-            <w:tcW w:type="dxa" w:w="3515"/>
+            <w:tcW w:type="dxa" w:w="3345"/>
           </w:tcPr>
           <w:p>
             <w:pPr>
@@ -370,7 +371,7 @@
         </w:tc>
         <w:tc>
           <w:tcPr>
-            <w:tcW w:type="dxa" w:w="2721"/>
+            <w:tcW w:type="dxa" w:w="2665"/>
           </w:tcPr>
           <w:p>
             <w:pPr>
@@ -391,7 +392,7 @@
       <w:tr>
         <w:tc>
           <w:tcPr>
-            <w:tcW w:type="dxa" w:w="1474"/>
+            <w:tcW w:type="dxa" w:w="1587"/>
           </w:tcPr>
           <w:p>
             <w:pPr>
@@ -410,7 +411,7 @@
         </w:tc>
         <w:tc>
           <w:tcPr>
-            <w:tcW w:type="dxa" w:w="794"/>
+            <w:tcW w:type="dxa" w:w="907"/>
           </w:tcPr>
           <w:p>
             <w:pPr>
@@ -430,7 +431,7 @@
         </w:tc>
         <w:tc>
           <w:tcPr>
-            <w:tcW w:type="dxa" w:w="3515"/>
+            <w:tcW w:type="dxa" w:w="3345"/>
           </w:tcPr>
           <w:p>
             <w:pPr>
@@ -449,7 +450,7 @@
         </w:tc>
         <w:tc>
           <w:tcPr>
-            <w:tcW w:type="dxa" w:w="2721"/>
+            <w:tcW w:type="dxa" w:w="2665"/>
           </w:tcPr>
           <w:p>
             <w:pPr>
@@ -470,7 +471,7 @@
       <w:tr>
         <w:tc>
           <w:tcPr>
-            <w:tcW w:type="dxa" w:w="1474"/>
+            <w:tcW w:type="dxa" w:w="1587"/>
           </w:tcPr>
           <w:p>
             <w:pPr>
@@ -489,7 +490,7 @@
         </w:tc>
         <w:tc>
           <w:tcPr>
-            <w:tcW w:type="dxa" w:w="794"/>
+            <w:tcW w:type="dxa" w:w="907"/>
           </w:tcPr>
           <w:p>
             <w:pPr>
@@ -509,7 +510,7 @@
         </w:tc>
         <w:tc>
           <w:tcPr>
-            <w:tcW w:type="dxa" w:w="3515"/>
+            <w:tcW w:type="dxa" w:w="3345"/>
           </w:tcPr>
           <w:p>
             <w:pPr>
@@ -528,7 +529,7 @@
         </w:tc>
         <w:tc>
           <w:tcPr>
-            <w:tcW w:type="dxa" w:w="2721"/>
+            <w:tcW w:type="dxa" w:w="2665"/>
           </w:tcPr>
           <w:p>
             <w:pPr>
@@ -549,7 +550,7 @@
       <w:tr>
         <w:tc>
           <w:tcPr>
-            <w:tcW w:type="dxa" w:w="1474"/>
+            <w:tcW w:type="dxa" w:w="1587"/>
           </w:tcPr>
           <w:p>
             <w:pPr>
@@ -568,7 +569,7 @@
         </w:tc>
         <w:tc>
           <w:tcPr>
-            <w:tcW w:type="dxa" w:w="794"/>
+            <w:tcW w:type="dxa" w:w="907"/>
           </w:tcPr>
           <w:p>
             <w:pPr>
@@ -588,7 +589,7 @@
         </w:tc>
         <w:tc>
           <w:tcPr>
-            <w:tcW w:type="dxa" w:w="3515"/>
+            <w:tcW w:type="dxa" w:w="3345"/>
           </w:tcPr>
           <w:p>
             <w:pPr>
@@ -607,7 +608,7 @@
         </w:tc>
         <w:tc>
           <w:tcPr>
-            <w:tcW w:type="dxa" w:w="2721"/>
+            <w:tcW w:type="dxa" w:w="2665"/>
           </w:tcPr>
           <w:p>
             <w:pPr>
@@ -628,7 +629,7 @@
       <w:tr>
         <w:tc>
           <w:tcPr>
-            <w:tcW w:type="dxa" w:w="1474"/>
+            <w:tcW w:type="dxa" w:w="1587"/>
           </w:tcPr>
           <w:p>
             <w:pPr>
@@ -647,7 +648,7 @@
         </w:tc>
         <w:tc>
           <w:tcPr>
-            <w:tcW w:type="dxa" w:w="794"/>
+            <w:tcW w:type="dxa" w:w="907"/>
           </w:tcPr>
           <w:p>
             <w:pPr>
@@ -667,7 +668,7 @@
         </w:tc>
         <w:tc>
           <w:tcPr>
-            <w:tcW w:type="dxa" w:w="3515"/>
+            <w:tcW w:type="dxa" w:w="3345"/>
           </w:tcPr>
           <w:p>
             <w:pPr>
@@ -686,7 +687,7 @@
         </w:tc>
         <w:tc>
           <w:tcPr>
-            <w:tcW w:type="dxa" w:w="2721"/>
+            <w:tcW w:type="dxa" w:w="2665"/>
           </w:tcPr>
           <w:p>
             <w:pPr>
@@ -707,7 +708,7 @@
       <w:tr>
         <w:tc>
           <w:tcPr>
-            <w:tcW w:type="dxa" w:w="1474"/>
+            <w:tcW w:type="dxa" w:w="1587"/>
           </w:tcPr>
           <w:p>
             <w:pPr>
@@ -726,7 +727,7 @@
         </w:tc>
         <w:tc>
           <w:tcPr>
-            <w:tcW w:type="dxa" w:w="794"/>
+            <w:tcW w:type="dxa" w:w="907"/>
           </w:tcPr>
           <w:p>
             <w:pPr>
@@ -746,7 +747,7 @@
         </w:tc>
         <w:tc>
           <w:tcPr>
-            <w:tcW w:type="dxa" w:w="3515"/>
+            <w:tcW w:type="dxa" w:w="3345"/>
           </w:tcPr>
           <w:p>
             <w:pPr>
@@ -765,7 +766,7 @@
         </w:tc>
         <w:tc>
           <w:tcPr>
-            <w:tcW w:type="dxa" w:w="2721"/>
+            <w:tcW w:type="dxa" w:w="2665"/>
           </w:tcPr>
           <w:p>
             <w:pPr>
@@ -786,7 +787,7 @@
       <w:tr>
         <w:tc>
           <w:tcPr>
-            <w:tcW w:type="dxa" w:w="1474"/>
+            <w:tcW w:type="dxa" w:w="1587"/>
           </w:tcPr>
           <w:p>
             <w:pPr>
@@ -805,7 +806,7 @@
         </w:tc>
         <w:tc>
           <w:tcPr>
-            <w:tcW w:type="dxa" w:w="794"/>
+            <w:tcW w:type="dxa" w:w="907"/>
           </w:tcPr>
           <w:p>
             <w:pPr>
@@ -825,7 +826,7 @@
         </w:tc>
         <w:tc>
           <w:tcPr>
-            <w:tcW w:type="dxa" w:w="3515"/>
+            <w:tcW w:type="dxa" w:w="3345"/>
           </w:tcPr>
           <w:p>
             <w:pPr>
@@ -844,7 +845,7 @@
         </w:tc>
         <w:tc>
           <w:tcPr>
-            <w:tcW w:type="dxa" w:w="2721"/>
+            <w:tcW w:type="dxa" w:w="2665"/>
           </w:tcPr>
           <w:p>
             <w:pPr>
@@ -865,7 +866,7 @@
       <w:tr>
         <w:tc>
           <w:tcPr>
-            <w:tcW w:type="dxa" w:w="1474"/>
+            <w:tcW w:type="dxa" w:w="1587"/>
           </w:tcPr>
           <w:p>
             <w:pPr>
@@ -884,7 +885,7 @@
         </w:tc>
         <w:tc>
           <w:tcPr>
-            <w:tcW w:type="dxa" w:w="794"/>
+            <w:tcW w:type="dxa" w:w="907"/>
           </w:tcPr>
           <w:p>
             <w:pPr>
@@ -904,7 +905,7 @@
         </w:tc>
         <w:tc>
           <w:tcPr>
-            <w:tcW w:type="dxa" w:w="3515"/>
+            <w:tcW w:type="dxa" w:w="3345"/>
           </w:tcPr>
           <w:p>
             <w:pPr>
@@ -923,7 +924,7 @@
         </w:tc>
         <w:tc>
           <w:tcPr>
-            <w:tcW w:type="dxa" w:w="2721"/>
+            <w:tcW w:type="dxa" w:w="2665"/>
           </w:tcPr>
           <w:p>
             <w:pPr>
@@ -944,7 +945,7 @@
       <w:tr>
         <w:tc>
           <w:tcPr>
-            <w:tcW w:type="dxa" w:w="1474"/>
+            <w:tcW w:type="dxa" w:w="1587"/>
           </w:tcPr>
           <w:p>
             <w:pPr>
@@ -963,7 +964,7 @@
         </w:tc>
         <w:tc>
           <w:tcPr>
-            <w:tcW w:type="dxa" w:w="794"/>
+            <w:tcW w:type="dxa" w:w="907"/>
           </w:tcPr>
           <w:p>
             <w:pPr>
@@ -983,7 +984,7 @@
         </w:tc>
         <w:tc>
           <w:tcPr>
-            <w:tcW w:type="dxa" w:w="3515"/>
+            <w:tcW w:type="dxa" w:w="3345"/>
           </w:tcPr>
           <w:p>
             <w:pPr>
@@ -1002,7 +1003,7 @@
         </w:tc>
         <w:tc>
           <w:tcPr>
-            <w:tcW w:type="dxa" w:w="2721"/>
+            <w:tcW w:type="dxa" w:w="2665"/>
           </w:tcPr>
           <w:p>
             <w:pPr>
@@ -1023,7 +1024,7 @@
       <w:tr>
         <w:tc>
           <w:tcPr>
-            <w:tcW w:type="dxa" w:w="1474"/>
+            <w:tcW w:type="dxa" w:w="1587"/>
           </w:tcPr>
           <w:p>
             <w:pPr>
@@ -1042,7 +1043,7 @@
         </w:tc>
         <w:tc>
           <w:tcPr>
-            <w:tcW w:type="dxa" w:w="794"/>
+            <w:tcW w:type="dxa" w:w="907"/>
           </w:tcPr>
           <w:p>
             <w:pPr>
@@ -1062,7 +1063,7 @@
         </w:tc>
         <w:tc>
           <w:tcPr>
-            <w:tcW w:type="dxa" w:w="3515"/>
+            <w:tcW w:type="dxa" w:w="3345"/>
           </w:tcPr>
           <w:p>
             <w:pPr>
@@ -1081,7 +1082,7 @@
         </w:tc>
         <w:tc>
           <w:tcPr>
-            <w:tcW w:type="dxa" w:w="2721"/>
+            <w:tcW w:type="dxa" w:w="2665"/>
           </w:tcPr>
           <w:p>
             <w:pPr>
@@ -1102,7 +1103,7 @@
       <w:tr>
         <w:tc>
           <w:tcPr>
-            <w:tcW w:type="dxa" w:w="1474"/>
+            <w:tcW w:type="dxa" w:w="1587"/>
           </w:tcPr>
           <w:p>
             <w:pPr>
@@ -1121,7 +1122,7 @@
         </w:tc>
         <w:tc>
           <w:tcPr>
-            <w:tcW w:type="dxa" w:w="794"/>
+            <w:tcW w:type="dxa" w:w="907"/>
           </w:tcPr>
           <w:p>
             <w:pPr>
@@ -1141,7 +1142,7 @@
         </w:tc>
         <w:tc>
           <w:tcPr>
-            <w:tcW w:type="dxa" w:w="3515"/>
+            <w:tcW w:type="dxa" w:w="3345"/>
           </w:tcPr>
           <w:p>
             <w:pPr>
@@ -1160,7 +1161,7 @@
         </w:tc>
         <w:tc>
           <w:tcPr>
-            <w:tcW w:type="dxa" w:w="2721"/>
+            <w:tcW w:type="dxa" w:w="2665"/>
           </w:tcPr>
           <w:p>
             <w:pPr>

</xml_diff>